<commit_message>
Complete corpus (163 forms, 489 examples); curate ambiguous brackets and acronym labels
Library: the full authored corpus is now in the repo — 100 docx + 63 xlsx forms,
489 worked examples, with regenerated traceability, manifest, and compiled copies.
Tracker renamed off the "--" prefix; generate-lookup and related data updated.

Curation against the complete corpus:
- Ambiguous brackets 45 -> 0: 2 dropdowns (Severity, Remote-Access Method), 14
  fill-in fields, 29 complete-default/cross-reference statements un-bracketed to
  literal, [12 months] relabeled to [review period]. A-046 outer scope bracket
  removed with its inner [Director / Coordinator] field kept.
- securityCoordinator curated as a shared, fill-once role (recurred across 15 forms).
- humanizeTag is acronym-aware (MFA, IT, CAD, NTP, SIP, CJIS, VLAN, VoIP, ESInet,
  DMZ, RTO, RPO, GIS, IDS, IPS, ...), so the un-curated tail labels correctly.

tsc / eslint / strict template-lint / next build all green.
</commit_message>
<xml_diff>
--- a/public/templates/compiled/forms/A-001-CybersecurityCharterLeadershipDesignationLetter-FORM.docx
+++ b/public/templates/compiled/forms/A-001-CybersecurityCharterLeadershipDesignationLetter-FORM.docx
@@ -34,6 +34,9 @@
         <w:gridCol w:w="9360"/>
       </w:tblGrid>
       <w:tr>
+        <w:trPr>
+          <w:cantSplit/>
+        </w:trPr>
         <w:tc>
           <w:tcPr>
             <w:tcW w:type="dxa" w:w="9360"/>
@@ -316,6 +319,9 @@
         <w:gridCol w:w="9360"/>
       </w:tblGrid>
       <w:tr>
+        <w:trPr>
+          <w:cantSplit/>
+        </w:trPr>
         <w:tc>
           <w:tcPr>
             <w:tcW w:type="dxa" w:w="9360"/>
@@ -993,6 +999,7 @@
       </w:tblGrid>
       <w:tr>
         <w:trPr>
+          <w:cantSplit/>
           <w:tblHeader/>
         </w:trPr>
         <w:tc>
@@ -1059,6 +1066,9 @@
         </w:tc>
       </w:tr>
       <w:tr>
+        <w:trPr>
+          <w:cantSplit/>
+        </w:trPr>
         <w:tc>
           <w:tcPr>
             <w:tcW w:type="dxa" w:w="3000"/>
@@ -1123,6 +1133,9 @@
         </w:tc>
       </w:tr>
       <w:tr>
+        <w:trPr>
+          <w:cantSplit/>
+        </w:trPr>
         <w:tc>
           <w:tcPr>
             <w:tcW w:type="dxa" w:w="3000"/>
@@ -1187,6 +1200,9 @@
         </w:tc>
       </w:tr>
       <w:tr>
+        <w:trPr>
+          <w:cantSplit/>
+        </w:trPr>
         <w:tc>
           <w:tcPr>
             <w:tcW w:type="dxa" w:w="3000"/>
@@ -1251,6 +1267,9 @@
         </w:tc>
       </w:tr>
       <w:tr>
+        <w:trPr>
+          <w:cantSplit/>
+        </w:trPr>
         <w:tc>
           <w:tcPr>
             <w:tcW w:type="dxa" w:w="3000"/>
@@ -1315,6 +1334,9 @@
         </w:tc>
       </w:tr>
       <w:tr>
+        <w:trPr>
+          <w:cantSplit/>
+        </w:trPr>
         <w:tc>
           <w:tcPr>
             <w:tcW w:type="dxa" w:w="3000"/>
@@ -1630,6 +1652,7 @@
       </w:tblGrid>
       <w:tr>
         <w:trPr>
+          <w:cantSplit/>
           <w:tblHeader/>
         </w:trPr>
         <w:tc>
@@ -1696,6 +1719,9 @@
         </w:tc>
       </w:tr>
       <w:tr>
+        <w:trPr>
+          <w:cantSplit/>
+        </w:trPr>
         <w:tc>
           <w:tcPr>
             <w:tcW w:type="dxa" w:w="3200"/>
@@ -1760,6 +1786,9 @@
         </w:tc>
       </w:tr>
       <w:tr>
+        <w:trPr>
+          <w:cantSplit/>
+        </w:trPr>
         <w:tc>
           <w:tcPr>
             <w:tcW w:type="dxa" w:w="3200"/>
@@ -1824,6 +1853,9 @@
         </w:tc>
       </w:tr>
       <w:tr>
+        <w:trPr>
+          <w:cantSplit/>
+        </w:trPr>
         <w:tc>
           <w:tcPr>
             <w:tcW w:type="dxa" w:w="3200"/>
@@ -1909,6 +1941,9 @@
         <w:gridCol w:w="9360"/>
       </w:tblGrid>
       <w:tr>
+        <w:trPr>
+          <w:cantSplit/>
+        </w:trPr>
         <w:tc>
           <w:tcPr>
             <w:tcW w:type="dxa" w:w="9360"/>
@@ -2035,6 +2070,7 @@
       </w:tblGrid>
       <w:tr>
         <w:trPr>
+          <w:cantSplit/>
           <w:tblHeader/>
         </w:trPr>
         <w:tc>
@@ -2163,6 +2199,9 @@
         </w:tc>
       </w:tr>
       <w:tr>
+        <w:trPr>
+          <w:cantSplit/>
+        </w:trPr>
         <w:tc>
           <w:tcPr>
             <w:tcW w:type="dxa" w:w="3000"/>
@@ -2250,6 +2289,9 @@
         </w:tc>
       </w:tr>
       <w:tr>
+        <w:trPr>
+          <w:cantSplit/>
+        </w:trPr>
         <w:tc>
           <w:tcPr>
             <w:tcW w:type="dxa" w:w="3000"/>
@@ -2374,6 +2416,7 @@
       </w:tblGrid>
       <w:tr>
         <w:trPr>
+          <w:cantSplit/>
           <w:tblHeader/>
         </w:trPr>
         <w:tc>
@@ -2502,6 +2545,9 @@
         </w:tc>
       </w:tr>
       <w:tr>
+        <w:trPr>
+          <w:cantSplit/>
+        </w:trPr>
         <w:tc>
           <w:tcPr>
             <w:tcW w:type="dxa" w:w="1300"/>
@@ -2649,6 +2695,9 @@
         <w:gridCol w:w="9360"/>
       </w:tblGrid>
       <w:tr>
+        <w:trPr>
+          <w:cantSplit/>
+        </w:trPr>
         <w:tc>
           <w:tcPr>
             <w:tcW w:type="dxa" w:w="9360"/>
@@ -2710,12 +2759,13 @@
                 <w:sz w:val="24"/>
                 <w:szCs w:val="24"/>
               </w:rPr>
-              <w:t xml:space="preserve">A-001 names a specific individual as the Designated Cybersecurity and Privacy Lead. This is the one named-person field in the form (the project's role-not-name exception). The PSAP fills {fullName2} and {title2} and revises the charter when that person changes. Cross-referenced artifacts use their Tracker names: Cybersecurity Budget &amp; Resource Allocation Record, Leadership Security Review Meeting Minutes, Risk Management Methodology Standard, IT Support Accountability Agreement. Confirm the NENA-STA-040.2-2024 sections (§4.1.1 Senior Management, §4.1.2 Policies) against the standard in force. Agency-supplied values left in brackets: {agencyName}, authorizing official, designated lead name and title, version, effective and review dates, and the committed budget line.</w:t>
+              <w:t>This designation letter names a specific individual as the Designated Cybersecurity and Privacy Lead. This is the one named-person field in the form (the project's role-not-name exception). The PSAP fills {fullName2} and {title2} and revises the charter when that person changes. Cross-referenced artifacts use their Tracker names: Cybersecurity Budget &amp; Resource Allocation Record, Leadership Security Review Meeting Minutes, Risk Management Methodology Standard, IT Support Accountability Agreement. Confirm the NENA-STA-040.2-2024 sections (§4.1.1 Senior Management, §4.1.2 Policies) against the standard in force. Agency-supplied values left in brackets: {agencyName}, authorizing official, designated lead name and title, version, effective and review dates, and the committed budget line.</w:t>
             </w:r>
           </w:p>
         </w:tc>
       </w:tr>
     </w:tbl>
+    <w:p/>
     <w:sectPr>
       <w:headerReference w:type="default" r:id="rId7"/>
       <w:footerReference w:type="default" r:id="rId8"/>
@@ -2726,10 +2776,6 @@
     </w:sectPr>
   </w:body>
 </w:document>
-</file>
-
-<file path=word/comments.xml><?xml version="1.0" encoding="utf-8"?>
-<w:comments xmlns:cx="http://schemas.microsoft.com/office/drawing/2014/chartex" xmlns:cx1="http://schemas.microsoft.com/office/drawing/2015/9/8/chartex" xmlns:cx2="http://schemas.microsoft.com/office/drawing/2015/10/21/chartex" xmlns:cx3="http://schemas.microsoft.com/office/drawing/2016/5/9/chartex" xmlns:cx4="http://schemas.microsoft.com/office/drawing/2016/5/10/chartex" xmlns:cx5="http://schemas.microsoft.com/office/drawing/2016/5/11/chartex" xmlns:cx6="http://schemas.microsoft.com/office/drawing/2016/5/12/chartex" xmlns:cx7="http://schemas.microsoft.com/office/drawing/2016/5/13/chartex" xmlns:cx8="http://schemas.microsoft.com/office/drawing/2016/5/14/chartex" xmlns:mc="http://schemas.openxmlformats.org/markup-compatibility/2006" xmlns:aink="http://schemas.microsoft.com/office/drawing/2016/ink" xmlns:am3d="http://schemas.microsoft.com/office/drawing/2017/model3d" xmlns:o="urn:schemas-microsoft-com:office:office" xmlns:r="http://schemas.openxmlformats.org/officeDocument/2006/relationships" xmlns:m="http://schemas.openxmlformats.org/officeDocument/2006/math" xmlns:v="urn:schemas-microsoft-com:vml" xmlns:wp14="http://schemas.microsoft.com/office/word/2010/wordprocessingDrawing" xmlns:wp="http://schemas.openxmlformats.org/drawingml/2006/wordprocessingDrawing" xmlns:w10="urn:schemas-microsoft-com:office:word" xmlns:w="http://schemas.openxmlformats.org/wordprocessingml/2006/main" xmlns:w14="http://schemas.microsoft.com/office/word/2010/wordml" xmlns:w15="http://schemas.microsoft.com/office/word/2012/wordml" xmlns:w16cex="http://schemas.microsoft.com/office/word/2018/wordml/cex" xmlns:w16cid="http://schemas.microsoft.com/office/word/2016/wordml/cid" xmlns:w16="http://schemas.microsoft.com/office/word/2018/wordml" xmlns:w16sdtdh="http://schemas.microsoft.com/office/word/2020/wordml/sdtdatahash" xmlns:w16se="http://schemas.microsoft.com/office/word/2015/wordml/symex" xmlns:wpg="http://schemas.microsoft.com/office/word/2010/wordprocessingGroup" xmlns:wpi="http://schemas.microsoft.com/office/word/2010/wordprocessingInk" xmlns:wne="http://schemas.microsoft.com/office/word/2006/wordml" xmlns:wps="http://schemas.microsoft.com/office/word/2010/wordprocessingShape"/>
 </file>
 
 <file path=word/endnotes.xml><?xml version="1.0" encoding="utf-8"?>
@@ -3140,37 +3186,24 @@
       <w:szCs w:val="56"/>
     </w:rPr>
   </w:style>
-  <w:style w:type="paragraph" w:styleId="Heading1">
-    <w:name w:val="Heading 1"/>
-    <w:basedOn w:val="Normal"/>
-    <w:next w:val="Normal"/>
-    <w:qFormat/>
-    <w:rPr>
-      <w:color w:val="2E74B5"/>
-      <w:sz w:val="32"/>
-      <w:szCs w:val="32"/>
-    </w:rPr>
-  </w:style>
-  <w:style w:type="paragraph" w:styleId="Heading2">
-    <w:name w:val="Heading 2"/>
-    <w:basedOn w:val="Normal"/>
-    <w:next w:val="Normal"/>
-    <w:qFormat/>
-    <w:rPr>
-      <w:color w:val="2E74B5"/>
-      <w:sz w:val="26"/>
-      <w:szCs w:val="26"/>
-    </w:rPr>
-  </w:style>
   <w:style w:type="paragraph" w:styleId="Heading3">
     <w:name w:val="Heading 3"/>
     <w:basedOn w:val="Normal"/>
     <w:next w:val="Normal"/>
     <w:qFormat/>
+    <w:pPr>
+      <w:keepNext/>
+      <w:keepLines/>
+      <w:spacing w:after="100" w:before="220"/>
+      <w:outlineLvl w:val="2"/>
+    </w:pPr>
     <w:rPr>
-      <w:color w:val="1F4D78"/>
-      <w:sz w:val="24"/>
-      <w:szCs w:val="24"/>
+      <w:rFonts w:ascii="Aptos" w:cs="Aptos" w:eastAsia="Aptos" w:hAnsi="Aptos"/>
+      <w:b/>
+      <w:bCs/>
+      <w:color w:val="1B3A5C"/>
+      <w:sz w:val="26"/>
+      <w:szCs w:val="26"/>
     </w:rPr>
   </w:style>
   <w:style w:type="paragraph" w:styleId="Heading4">
@@ -3178,10 +3211,19 @@
     <w:basedOn w:val="Normal"/>
     <w:next w:val="Normal"/>
     <w:qFormat/>
+    <w:pPr>
+      <w:keepNext/>
+      <w:keepLines/>
+      <w:spacing w:after="100" w:before="220"/>
+      <w:outlineLvl w:val="3"/>
+    </w:pPr>
     <w:rPr>
-      <w:i/>
-      <w:iCs/>
-      <w:color w:val="2E74B5"/>
+      <w:rFonts w:ascii="Aptos" w:cs="Aptos" w:eastAsia="Aptos" w:hAnsi="Aptos"/>
+      <w:b/>
+      <w:bCs/>
+      <w:color w:val="1B3A5C"/>
+      <w:sz w:val="24"/>
+      <w:szCs w:val="24"/>
     </w:rPr>
   </w:style>
   <w:style w:type="paragraph" w:styleId="Heading5">
@@ -3189,8 +3231,19 @@
     <w:basedOn w:val="Normal"/>
     <w:next w:val="Normal"/>
     <w:qFormat/>
+    <w:pPr>
+      <w:keepNext/>
+      <w:keepLines/>
+      <w:spacing w:after="100" w:before="220"/>
+      <w:outlineLvl w:val="4"/>
+    </w:pPr>
     <w:rPr>
-      <w:color w:val="2E74B5"/>
+      <w:rFonts w:ascii="Aptos" w:cs="Aptos" w:eastAsia="Aptos" w:hAnsi="Aptos"/>
+      <w:b/>
+      <w:bCs/>
+      <w:color w:val="1B3A5C"/>
+      <w:sz w:val="24"/>
+      <w:szCs w:val="24"/>
     </w:rPr>
   </w:style>
   <w:style w:type="paragraph" w:styleId="Heading6">
@@ -3198,8 +3251,19 @@
     <w:basedOn w:val="Normal"/>
     <w:next w:val="Normal"/>
     <w:qFormat/>
+    <w:pPr>
+      <w:keepNext/>
+      <w:keepLines/>
+      <w:spacing w:after="100" w:before="220"/>
+      <w:outlineLvl w:val="5"/>
+    </w:pPr>
     <w:rPr>
-      <w:color w:val="1F4D78"/>
+      <w:rFonts w:ascii="Aptos" w:cs="Aptos" w:eastAsia="Aptos" w:hAnsi="Aptos"/>
+      <w:b/>
+      <w:bCs/>
+      <w:color w:val="1B3A5C"/>
+      <w:sz w:val="24"/>
+      <w:szCs w:val="24"/>
     </w:rPr>
   </w:style>
   <w:style w:type="paragraph" w:styleId="Strong">
@@ -3307,6 +3371,8 @@
     <w:next w:val="Normal"/>
     <w:qFormat/>
     <w:pPr>
+      <w:keepNext/>
+      <w:keepLines/>
       <w:spacing w:after="160" w:before="240"/>
       <w:outlineLvl w:val="0"/>
     </w:pPr>
@@ -3325,6 +3391,8 @@
     <w:next w:val="Normal"/>
     <w:qFormat/>
     <w:pPr>
+      <w:keepNext/>
+      <w:keepLines/>
       <w:spacing w:after="100" w:before="220"/>
       <w:outlineLvl w:val="1"/>
     </w:pPr>

</xml_diff>